<commit_message>
Correct word doc added
</commit_message>
<xml_diff>
--- a/Milestone 2/CivicConnect_PED_v1.2 M2.docx
+++ b/Milestone 2/CivicConnect_PED_v1.2 M2.docx
@@ -2266,10 +2266,7 @@
               <w:t>,</w:t>
             </w:r>
             <w:r>
-              <w:t xml:space="preserve"> </w:t>
-            </w:r>
-            <w:r>
-              <w:t>Engineering Decision Log</w:t>
+              <w:t xml:space="preserve"> Engineering Decision Log</w:t>
             </w:r>
             <w:r>
               <w:t xml:space="preserve">, </w:t>
@@ -26903,40 +26900,24 @@
                 <w:sz w:val="22"/>
                 <w:szCs w:val="22"/>
               </w:rPr>
-              <w:t xml:space="preserve">.  </w:t>
-            </w:r>
-            <w:r>
+              <w:t>.  No longer applicable as of 2026/09/30.</w:t>
+            </w:r>
+          </w:p>
+          <w:p>
+            <w:pPr>
               <w:rPr>
                 <w:rFonts w:ascii="Times New Roman" w:hAnsi="Times New Roman" w:cs="Times New Roman"/>
                 <w:sz w:val="22"/>
                 <w:szCs w:val="22"/>
               </w:rPr>
-              <w:t>No longer applicable as of 2026/09/30.</w:t>
-            </w:r>
-          </w:p>
-          <w:p>
-            <w:pPr>
+            </w:pPr>
+            <w:r>
               <w:rPr>
                 <w:rFonts w:ascii="Times New Roman" w:hAnsi="Times New Roman" w:cs="Times New Roman"/>
                 <w:sz w:val="22"/>
                 <w:szCs w:val="22"/>
               </w:rPr>
-            </w:pPr>
-            <w:r>
-              <w:rPr>
-                <w:rFonts w:ascii="Times New Roman" w:hAnsi="Times New Roman" w:cs="Times New Roman"/>
-                <w:sz w:val="22"/>
-                <w:szCs w:val="22"/>
-              </w:rPr>
-              <w:t xml:space="preserve">Decision </w:t>
-            </w:r>
-            <w:r>
-              <w:rPr>
-                <w:rFonts w:ascii="Times New Roman" w:hAnsi="Times New Roman" w:cs="Times New Roman"/>
-                <w:sz w:val="22"/>
-                <w:szCs w:val="22"/>
-              </w:rPr>
-              <w:t>5</w:t>
+              <w:t>Decision 5</w:t>
             </w:r>
           </w:p>
         </w:tc>
@@ -27289,45 +27270,29 @@
                 <w:sz w:val="22"/>
                 <w:szCs w:val="22"/>
               </w:rPr>
-              <w:t>Architecture</w:t>
-            </w:r>
-            <w:r>
+              <w:t>Architecture: modular monolith ASP.Net Core application</w:t>
+            </w:r>
+          </w:p>
+        </w:tc>
+        <w:tc>
+          <w:tcPr>
+            <w:tcW w:w="1499" w:type="dxa"/>
+          </w:tcPr>
+          <w:p>
+            <w:pPr>
               <w:rPr>
                 <w:rFonts w:ascii="Times New Roman" w:hAnsi="Times New Roman" w:cs="Times New Roman"/>
                 <w:sz w:val="22"/>
                 <w:szCs w:val="22"/>
               </w:rPr>
-              <w:t>: modular monolith ASP.Net Core application</w:t>
-            </w:r>
-          </w:p>
-        </w:tc>
-        <w:tc>
-          <w:tcPr>
-            <w:tcW w:w="1499" w:type="dxa"/>
-          </w:tcPr>
-          <w:p>
-            <w:pPr>
+            </w:pPr>
+            <w:r>
               <w:rPr>
                 <w:rFonts w:ascii="Times New Roman" w:hAnsi="Times New Roman" w:cs="Times New Roman"/>
                 <w:sz w:val="22"/>
                 <w:szCs w:val="22"/>
               </w:rPr>
-            </w:pPr>
-            <w:r>
-              <w:rPr>
-                <w:rFonts w:ascii="Times New Roman" w:hAnsi="Times New Roman" w:cs="Times New Roman"/>
-                <w:sz w:val="22"/>
-                <w:szCs w:val="22"/>
-              </w:rPr>
-              <w:t xml:space="preserve">Decided. </w:t>
-            </w:r>
-            <w:r>
-              <w:rPr>
-                <w:rFonts w:ascii="Times New Roman" w:hAnsi="Times New Roman" w:cs="Times New Roman"/>
-                <w:sz w:val="22"/>
-                <w:szCs w:val="22"/>
-              </w:rPr>
-              <w:t>2026/09/30</w:t>
+              <w:t>Decided. 2026/09/30</w:t>
             </w:r>
           </w:p>
         </w:tc>
@@ -28406,15 +28371,7 @@
                 <w:sz w:val="22"/>
                 <w:szCs w:val="22"/>
               </w:rPr>
-              <w:t>in process</w:t>
-            </w:r>
-            <w:r>
-              <w:rPr>
-                <w:rFonts w:ascii="Times New Roman" w:hAnsi="Times New Roman" w:cs="Times New Roman"/>
-                <w:sz w:val="22"/>
-                <w:szCs w:val="22"/>
-              </w:rPr>
-              <w:t xml:space="preserve"> interface suits a single deployable application</w:t>
+              <w:t>in process interface suits a single deployable application</w:t>
             </w:r>
           </w:p>
         </w:tc>
@@ -28512,15 +28469,7 @@
                 <w:sz w:val="22"/>
                 <w:szCs w:val="22"/>
               </w:rPr>
-              <w:t>2026/09/</w:t>
-            </w:r>
-            <w:r>
-              <w:rPr>
-                <w:rFonts w:ascii="Times New Roman" w:hAnsi="Times New Roman" w:cs="Times New Roman"/>
-                <w:sz w:val="22"/>
-                <w:szCs w:val="22"/>
-              </w:rPr>
-              <w:t>28</w:t>
+              <w:t>2026/09/28</w:t>
             </w:r>
           </w:p>
           <w:p>
@@ -30689,6 +30638,10 @@
       <w:pPr>
         <w:spacing w:line="360" w:lineRule="auto"/>
         <w:ind w:left="720" w:hanging="720"/>
+        <w:rPr>
+          <w:sz w:val="28"/>
+          <w:szCs w:val="28"/>
+        </w:rPr>
       </w:pPr>
       <w:r>
         <w:rPr>
@@ -30729,6 +30682,190 @@
         </w:rPr>
         <w:t>. Sebastopol, CA: O’Reilly Media. Available at: https://abseil.io/resources/swe-book/html/ch13.html (Accessed: 28 September 2026).</w:t>
       </w:r>
+    </w:p>
+    <w:p>
+      <w:pPr>
+        <w:spacing w:line="360" w:lineRule="auto"/>
+        <w:ind w:left="720" w:hanging="720"/>
+        <w:rPr>
+          <w:sz w:val="28"/>
+          <w:szCs w:val="28"/>
+        </w:rPr>
+      </w:pPr>
+    </w:p>
+    <w:sdt>
+      <w:sdtPr>
+        <w:id w:val="1938253764"/>
+        <w:docPartObj>
+          <w:docPartGallery w:val="Bibliographies"/>
+          <w:docPartUnique/>
+        </w:docPartObj>
+      </w:sdtPr>
+      <w:sdtEndPr>
+        <w:rPr>
+          <w:rFonts w:asciiTheme="minorHAnsi" w:eastAsiaTheme="minorHAnsi" w:hAnsiTheme="minorHAnsi" w:cstheme="minorBidi"/>
+          <w:color w:val="auto"/>
+          <w:sz w:val="24"/>
+          <w:szCs w:val="24"/>
+        </w:rPr>
+      </w:sdtEndPr>
+      <w:sdtContent>
+        <w:p>
+          <w:pPr>
+            <w:pStyle w:val="Heading1"/>
+          </w:pPr>
+          <w:r>
+            <w:t>References</w:t>
+          </w:r>
+        </w:p>
+        <w:sdt>
+          <w:sdtPr>
+            <w:id w:val="-573587230"/>
+            <w:bibliography/>
+          </w:sdtPr>
+          <w:sdtContent>
+            <w:p>
+              <w:pPr>
+                <w:pStyle w:val="Bibliography"/>
+                <w:rPr>
+                  <w:noProof/>
+                  <w:kern w:val="0"/>
+                  <w14:ligatures w14:val="none"/>
+                </w:rPr>
+              </w:pPr>
+              <w:r>
+                <w:fldChar w:fldCharType="begin"/>
+              </w:r>
+              <w:r>
+                <w:instrText xml:space="preserve"> BIBLIOGRAPHY </w:instrText>
+              </w:r>
+              <w:r>
+                <w:fldChar w:fldCharType="separate"/>
+              </w:r>
+              <w:r>
+                <w:rPr>
+                  <w:noProof/>
+                </w:rPr>
+                <w:t xml:space="preserve">ISO/IEC, 2023. </w:t>
+              </w:r>
+              <w:r>
+                <w:rPr>
+                  <w:i/>
+                  <w:iCs/>
+                  <w:noProof/>
+                </w:rPr>
+                <w:t xml:space="preserve">Software engineering Systems and software Quality Requirements and Evaluation (SQuaRE) — Quality model for AI systems. </w:t>
+              </w:r>
+              <w:r>
+                <w:rPr>
+                  <w:noProof/>
+                </w:rPr>
+                <w:t>s.l.:s.n.</w:t>
+              </w:r>
+            </w:p>
+            <w:p>
+              <w:pPr>
+                <w:pStyle w:val="Bibliography"/>
+                <w:rPr>
+                  <w:noProof/>
+                </w:rPr>
+              </w:pPr>
+              <w:r>
+                <w:rPr>
+                  <w:noProof/>
+                </w:rPr>
+                <w:t xml:space="preserve">Meta, 2026. </w:t>
+              </w:r>
+              <w:r>
+                <w:rPr>
+                  <w:i/>
+                  <w:iCs/>
+                  <w:noProof/>
+                </w:rPr>
+                <w:t xml:space="preserve">WhatsApp Business Platform. </w:t>
+              </w:r>
+              <w:r>
+                <w:rPr>
+                  <w:noProof/>
+                </w:rPr>
+                <w:t xml:space="preserve">[Online] </w:t>
+              </w:r>
+              <w:r>
+                <w:rPr>
+                  <w:noProof/>
+                </w:rPr>
+                <w:br/>
+                <w:t xml:space="preserve">Available at: </w:t>
+              </w:r>
+              <w:r>
+                <w:rPr>
+                  <w:noProof/>
+                  <w:u w:val="single"/>
+                </w:rPr>
+                <w:t>https://developers.facebook.com/documentation/business-messaging/whatsapp/pricing/non-template-messages</w:t>
+              </w:r>
+            </w:p>
+            <w:p>
+              <w:pPr>
+                <w:pStyle w:val="Bibliography"/>
+                <w:rPr>
+                  <w:noProof/>
+                </w:rPr>
+              </w:pPr>
+              <w:r>
+                <w:rPr>
+                  <w:noProof/>
+                </w:rPr>
+                <w:t xml:space="preserve">Republic of South Africa, 2013. </w:t>
+              </w:r>
+              <w:r>
+                <w:rPr>
+                  <w:i/>
+                  <w:iCs/>
+                  <w:noProof/>
+                </w:rPr>
+                <w:t xml:space="preserve">popia. </w:t>
+              </w:r>
+              <w:r>
+                <w:rPr>
+                  <w:noProof/>
+                </w:rPr>
+                <w:t xml:space="preserve">[Online] </w:t>
+              </w:r>
+              <w:r>
+                <w:rPr>
+                  <w:noProof/>
+                </w:rPr>
+                <w:br/>
+                <w:t xml:space="preserve">Available at: </w:t>
+              </w:r>
+              <w:r>
+                <w:rPr>
+                  <w:noProof/>
+                  <w:u w:val="single"/>
+                </w:rPr>
+                <w:t>https://popia.co.za</w:t>
+              </w:r>
+            </w:p>
+            <w:p>
+              <w:r>
+                <w:rPr>
+                  <w:b/>
+                  <w:bCs/>
+                  <w:noProof/>
+                </w:rPr>
+                <w:fldChar w:fldCharType="end"/>
+              </w:r>
+            </w:p>
+          </w:sdtContent>
+        </w:sdt>
+      </w:sdtContent>
+    </w:sdt>
+    <w:p>
+      <w:pPr>
+        <w:spacing w:line="360" w:lineRule="auto"/>
+        <w:ind w:left="720" w:hanging="720"/>
+      </w:pPr>
     </w:p>
     <w:sectPr>
       <w:pgSz w:w="11906" w:h="16838"/>
@@ -35936,6 +36073,7 @@
   <w:style w:type="character" w:default="1" w:styleId="DefaultParagraphFont">
     <w:name w:val="Default Paragraph Font"/>
     <w:uiPriority w:val="1"/>
+    <w:semiHidden/>
     <w:unhideWhenUsed/>
   </w:style>
   <w:style w:type="table" w:default="1" w:styleId="TableNormal">
@@ -36320,6 +36458,14 @@
       <w:color w:val="605E5C"/>
       <w:shd w:val="clear" w:color="auto" w:fill="E1DFDD"/>
     </w:rPr>
+  </w:style>
+  <w:style w:type="paragraph" w:styleId="Bibliography">
+    <w:name w:val="Bibliography"/>
+    <w:basedOn w:val="Normal"/>
+    <w:next w:val="Normal"/>
+    <w:uiPriority w:val="37"/>
+    <w:unhideWhenUsed/>
+    <w:rsid w:val="00D5209F"/>
   </w:style>
 </w:styles>
 </file>

</xml_diff>